<commit_message>
Add logo field to Business model with validation and upload settings
</commit_message>
<xml_diff>
--- a/docs/CRM + Invoicing SaaS — Django Data Model & Architecture.docx
+++ b/docs/CRM + Invoicing SaaS — Django Data Model & Architecture.docx
@@ -156,7 +156,7 @@
         <w:rPr>
           <w:rtl w:val="0"/>
         </w:rPr>
-        <w:t xml:space="preserve">Supports a responsive web application and a future mobile API from one authoritative backend</w:t>
+        <w:t xml:space="preserve">Supports a responsive web application first and a Flutter mobile client later for iOS and Android from one authoritative backend and shared service layer</w:t>
       </w:r>
     </w:p>
     <w:p>
@@ -195,7 +195,7 @@
         <w:rPr>
           <w:rtl w:val="0"/>
         </w:rPr>
-        <w:t xml:space="preserve">The backend owns all business rules. Web views, API endpoints, background jobs, and the future mobile application must call the same application services.</w:t>
+        <w:t xml:space="preserve">The backend owns all business rules. Web views, API endpoints, background jobs, and the Flutter mobile application must call the same application services. Treat the product as one SaaS platform with multiple clients, not as separate web, iOS, and Android systems.</w:t>
       </w:r>
     </w:p>
     <w:p>
@@ -14162,7 +14162,7 @@
         <w:rPr>
           <w:rtl w:val="0"/>
         </w:rPr>
-        <w:t xml:space="preserve">24. Web and REST API architecture</w:t>
+        <w:t xml:space="preserve">24. Web, REST API, and Flutter mobile architecture</w:t>
       </w:r>
     </w:p>
     <w:p>
@@ -14280,7 +14280,7 @@
         <w:rPr>
           <w:rtl w:val="0"/>
         </w:rPr>
-        <w:t xml:space="preserve">This keeps the learning project understandable and accelerates a reliable first release.</w:t>
+        <w:t xml:space="preserve">This keeps the learning project understandable and accelerates a reliable first release. The web client is built first so the domain model, calculations, permissions, documents, and payment workflows can stabilize before a second client depends on them.</w:t>
       </w:r>
     </w:p>
     <w:p>
@@ -14642,7 +14642,7 @@
         <w:rPr>
           <w:rtl w:val="0"/>
         </w:rPr>
-        <w:t xml:space="preserve">Version the API before a mobile client depends on it</w:t>
+        <w:t xml:space="preserve">Version and stabilize the API before the Flutter iOS/Android client depends on it</w:t>
       </w:r>
     </w:p>
     <w:p>
@@ -14698,7 +14698,7 @@
         <w:rPr>
           <w:rtl w:val="0"/>
         </w:rPr>
-        <w:t xml:space="preserve">For the future first-party mobile application, add a dedicated token strategy with:</w:t>
+        <w:t xml:space="preserve">For the first-party Flutter mobile application on iOS and Android, add a dedicated token strategy with:</w:t>
       </w:r>
     </w:p>
     <w:p>
@@ -14788,28 +14788,28 @@
         <w:rPr>
           <w:rtl w:val="0"/>
         </w:rPr>
-        <w:t xml:space="preserve">Secure storage on the device</w:t>
-      </w:r>
-    </w:p>
-    <w:p>
-      <w:pPr>
-        <w:rPr/>
-      </w:pPr>
-      <w:r>
-        <w:rPr>
-          <w:rtl w:val="0"/>
-        </w:rPr>
-      </w:r>
-    </w:p>
-    <w:p>
-      <w:pPr>
-        <w:rPr/>
-      </w:pPr>
-      <w:r>
-        <w:rPr>
-          <w:rtl w:val="0"/>
-        </w:rPr>
-        <w:t xml:space="preserve">Do not add mobile token authentication before the mobile/API phase requires it.</w:t>
+        <w:t xml:space="preserve">Platform-secure token storage: Keychain on iOS and Keystore-backed secure storage on Android</w:t>
+      </w:r>
+    </w:p>
+    <w:p>
+      <w:pPr>
+        <w:rPr/>
+      </w:pPr>
+      <w:r>
+        <w:rPr>
+          <w:rtl w:val="0"/>
+        </w:rPr>
+      </w:r>
+    </w:p>
+    <w:p>
+      <w:pPr>
+        <w:rPr/>
+      </w:pPr>
+      <w:r>
+        <w:rPr>
+          <w:rtl w:val="0"/>
+        </w:rPr>
+        <w:t xml:space="preserve">Do not add mobile token authentication before the API/mobile phase requires it. The approved mobile baseline is Dart + Flutter, using Dart async/await with a small typed API-client layer shared across the iOS and Android builds. Store credentials through a platform-secure storage abstraction backed by Keychain on iOS and the Android Keystore. The initial synchronization model is server-first: successful writes are committed through the API and the server response becomes the authoritative client state. Do not build an offline-first conflict-resolution system until real users demonstrate that requirement.</w:t>
       </w:r>
     </w:p>
     <w:p>
@@ -18958,7 +18958,7 @@
         <w:rPr>
           <w:rtl w:val="0"/>
         </w:rPr>
-        <w:t xml:space="preserve">Native mobile application</w:t>
+        <w:t xml:space="preserve">Flutter mobile application using Dart for iOS and Android</w:t>
       </w:r>
     </w:p>
     <w:p>
@@ -19409,7 +19409,7 @@
         <w:rPr>
           <w:rtl w:val="0"/>
         </w:rPr>
-        <w:t xml:space="preserve">Versioned REST API when external clients need it</w:t>
+        <w:t xml:space="preserve">Versioned REST API hardened before the Flutter iOS/Android client depends on it</w:t>
       </w:r>
     </w:p>
     <w:p>

</xml_diff>